<commit_message>
Refresh capstone document with renamed repository links
</commit_message>
<xml_diff>
--- a/Khanu Learning Capstone Documentation.docx
+++ b/Khanu Learning Capstone Documentation.docx
@@ -1246,7 +1246,7 @@
         <w:pStyle w:val="ListBullet"/>
       </w:pPr>
       <w:r>
-        <w:t>Open the `local-assistant` project folder in VS Code.</w:t>
+        <w:t>Open the extracted `Khanu-Learning-Complete` project folder in VS Code.</w:t>
       </w:r>
     </w:p>
     <w:p>
@@ -1286,7 +1286,7 @@
         <w:pStyle w:val="ListBullet"/>
       </w:pPr>
       <w:r>
-        <w:t>On Windows, `Start Assistant.bat` opens the local production app. The optional model is not needed for recommendations.</w:t>
+        <w:t>The optional model is not needed for recommendations.</w:t>
       </w:r>
     </w:p>
     <w:p>
@@ -1347,7 +1347,7 @@
     </w:p>
     <w:p>
       <w:r>
-        <w:t>No repository remote or public Pages URL is included in this local source package. Public deployment must be completed from the selected GitHub repository after choosing its name and visibility. See `docs/DEPLOYMENT.md` for the full checklist.</w:t>
+        <w:t>The source repository is https://github.com/gim1203-hue/khanu-learning and the live GitHub Pages browser demo is https://gim1203-hue.github.io/khanu-learning/. The Pages workflow reads the repository name automatically. Full-stack production persistence still requires a separately hosted backend and MongoDB connection. See `docs/DEPLOYMENT.md` for details.</w:t>
       </w:r>
     </w:p>
     <w:p>
@@ -1448,7 +1448,7 @@
     </w:p>
     <w:p>
       <w:r>
-        <w:t>The local source package includes the React experience, Express backend, Mongo models, matching logic, test suite, Pages workflow, browser-only Pages demo, and project documentation. The local production build and automated tests should be run before each submission. A public repository, public site URL, production database, and production backend are not configured in this source copy; they require the owner to choose/authorize those destinations and provide their service settings through secret managers.</w:t>
+        <w:t>The local source package includes the React experience, Express backend, Mongo models, matching logic, test suite, Pages workflow, browser-only Pages demo, and project documentation. The source is published at https://github.com/gim1203-hue/khanu-learning and the live Pages demo is https://gim1203-hue.github.io/khanu-learning/. The local production build and automated tests should be run before each submission. A production database and backend still require separate hosting and secure service settings.</w:t>
       </w:r>
     </w:p>
     <w:sectPr>

</xml_diff>